<commit_message>
Corrección de puntos de dolor
</commit_message>
<xml_diff>
--- a/Puntos de Dolor Priorizados.docx
+++ b/Puntos de Dolor Priorizados.docx
@@ -152,6 +152,24 @@
     </w:p>
     <w:p>
       <w:pPr>
+        <w:numPr>
+          <w:ilvl w:val="0"/>
+          <w:numId w:val="1"/>
+        </w:numPr>
+      </w:pPr>
+      <w:r>
+        <w:rPr>
+          <w:b/>
+          <w:bCs/>
+        </w:rPr>
+        <w:t>Evidencia:</w:t>
+      </w:r>
+      <w:r>
+        <w:t xml:space="preserve"> Program.cs, líneas 8-18 (instanciación directa de los cuatro servicios sin inyección de dependencias) y líneas 255-303 (la lógica de registro de venta se resuelve en línea dentro del switch del menú, sin una clase de dominio dedicada). Ver hallazgo H-13 del inventario de hallazgos.</w:t>
+      </w:r>
+    </w:p>
+    <w:p>
+      <w:pPr>
         <w:rPr>
           <w:b/>
           <w:bCs/>
@@ -274,42 +292,44 @@
     </w:p>
     <w:p>
       <w:pPr>
-        <w:rPr>
-          <w:b/>
-          <w:bCs/>
-        </w:rPr>
-      </w:pPr>
-      <w:r>
-        <w:rPr>
-          <w:b/>
-          <w:bCs/>
-        </w:rPr>
-        <w:t>3. Alto Acoplamiento entre Servicios de</w:t>
-      </w:r>
-      <w:r>
-        <w:rPr>
-          <w:b/>
-          <w:bCs/>
-        </w:rPr>
-        <w:t>l</w:t>
-      </w:r>
-      <w:r>
-        <w:rPr>
-          <w:b/>
-          <w:bCs/>
-        </w:rPr>
-        <w:t xml:space="preserve"> Negocio</w:t>
+        <w:numPr>
+          <w:ilvl w:val="0"/>
+          <w:numId w:val="2"/>
+        </w:numPr>
+      </w:pPr>
+      <w:r>
+        <w:rPr>
+          <w:b/>
+          <w:bCs/>
+        </w:rPr>
+        <w:t>Evidencia:</w:t>
+      </w:r>
+      <w:r>
+        <w:t xml:space="preserve"> Producto.cs, líneas 12-14 (propiedades Stock, StockMinimo y FechaVencimiento) y líneas 16-20 (el constructor exige estos valores a cualquier subclase, sin importar si aplican).</w:t>
       </w:r>
     </w:p>
     <w:p>
-      <w:r>
-        <w:t xml:space="preserve">Los servicios de la aplicación se instancian y referencian directamente entre sí mediante implementaciones concretas, sin depender de </w:t>
-      </w:r>
-      <w:r>
-        <w:t xml:space="preserve">las </w:t>
-      </w:r>
-      <w:r>
-        <w:t>abstracciones (interfaces).</w:t>
+      <w:pPr>
+        <w:rPr>
+          <w:b/>
+          <w:bCs/>
+        </w:rPr>
+      </w:pPr>
+      <w:r>
+        <w:rPr>
+          <w:b/>
+          <w:bCs/>
+        </w:rPr>
+        <w:t>3. Dependencia Directa de los Servicios hacia Implementaciones Concretas</w:t>
+      </w:r>
+    </w:p>
+    <w:p>
+      <w:r>
+        <w:t xml:space="preserve">Cada servicio de la aplicación instancia directamente sus propias dependencias concretas de bajo nivel (sus propios objetos Evento*, o la clase estática AspectoAutenticacion en el caso de ServicioUsuario) en lugar de depender de </w:t>
+      </w:r>
+      <w:r>
+        <w:lastRenderedPageBreak/>
+        <w:t>abstracciones (interfaces) que se le inyecten. Los cuatro servicios no se referencian entre sí; el acoplamiento real es de cada servicio hacia su propia infraestructura concreta, no entre los servicios de negocio.</w:t>
       </w:r>
     </w:p>
     <w:p>
@@ -327,19 +347,7 @@
         <w:t>Problema:</w:t>
       </w:r>
       <w:r>
-        <w:t> </w:t>
-      </w:r>
-      <w:r>
-        <w:t>Viola la</w:t>
-      </w:r>
-      <w:r>
-        <w:t xml:space="preserve"> Inversión de Dependencias </w:t>
-      </w:r>
-      <w:r>
-        <w:t>(</w:t>
-      </w:r>
-      <w:r>
-        <w:t>DIP).</w:t>
+        <w:t xml:space="preserve"> Viola la Inversión de Dependencias (DIP). No existe acoplamiento directo entre los cuatro servicios entre sí (ninguno referencia a otro); el acoplamiento real es de cada servicio hacia sus propias dependencias concretas de infraestructura.</w:t>
       </w:r>
     </w:p>
     <w:p>
@@ -357,25 +365,25 @@
         <w:t>Impacto:</w:t>
       </w:r>
       <w:r>
-        <w:t xml:space="preserve"> El código es rígido, frágil y difícil de mantener. Modificar la lógica de un servicio conlleva el riesgo de romper otros servicios </w:t>
-      </w:r>
-      <w:r>
-        <w:t>como consecuencia</w:t>
-      </w:r>
-      <w:r>
-        <w:t xml:space="preserve">. Complica </w:t>
-      </w:r>
-      <w:r>
-        <w:t>bastante</w:t>
-      </w:r>
-      <w:r>
-        <w:t xml:space="preserve"> la creación de </w:t>
-      </w:r>
-      <w:r>
-        <w:t>pruebas</w:t>
-      </w:r>
-      <w:r>
-        <w:t> para validar la lógica de negocio.</w:t>
+        <w:t xml:space="preserve"> El código es rígido y frágil frente a cambios de infraestructura: reemplazar el mecanismo de notificación (Evento*) o el mecanismo de autenticación (AspectoAutenticacion) obliga a modificar directamente el servicio que lo usa, sin un punto único de configuración. Complica bastante la creación de pruebas para validar la lógica de negocio de forma aislada.</w:t>
+      </w:r>
+    </w:p>
+    <w:p>
+      <w:pPr>
+        <w:numPr>
+          <w:ilvl w:val="0"/>
+          <w:numId w:val="3"/>
+        </w:numPr>
+      </w:pPr>
+      <w:r>
+        <w:rPr>
+          <w:b/>
+          <w:bCs/>
+        </w:rPr>
+        <w:t>Evidencia:</w:t>
+      </w:r>
+      <w:r>
+        <w:t xml:space="preserve"> ServicioProducto.cs, líneas 16-17, y ServicioUsuario.cs, línea 30 (llamada a AspectoAutenticacion.Login). Ver hallazgos H-06 y H-09 del inventario de hallazgos.</w:t>
       </w:r>
     </w:p>
     <w:p/>
@@ -396,7 +404,6 @@
     </w:p>
     <w:p>
       <w:r>
-        <w:lastRenderedPageBreak/>
         <w:t>La priorización de estos hallazgos se realizó utilizando los siguientes criterios:</w:t>
       </w:r>
     </w:p>
@@ -596,12 +603,13 @@
         <w:t xml:space="preserve"> unitarias </w:t>
       </w:r>
       <w:r>
-        <w:t>pro cada entidad de forma individual</w:t>
+        <w:t>por cada entidad de forma individual</w:t>
       </w:r>
       <w:r>
         <w:t xml:space="preserve">. El #1 bloquea la capacidad técnica del equipo para </w:t>
       </w:r>
       <w:r>
+        <w:lastRenderedPageBreak/>
         <w:t>modificar</w:t>
       </w:r>
       <w:r>
@@ -650,124 +658,10 @@
           <w:b/>
           <w:bCs/>
         </w:rPr>
-        <w:t>¿Por qué el #2 es más crítico que el #3</w:t>
-      </w:r>
-      <w:r>
-        <w:rPr>
-          <w:b/>
-          <w:bCs/>
-        </w:rPr>
-        <w:t xml:space="preserve">: </w:t>
-      </w:r>
-      <w:r>
-        <w:t xml:space="preserve">Mientras que el acoplamiento entre </w:t>
-      </w:r>
-      <w:r>
-        <w:t xml:space="preserve">los </w:t>
-      </w:r>
-      <w:r>
-        <w:t>servicios es un problema técnico de mantenibilidad que afecta al equipo</w:t>
-      </w:r>
-      <w:r>
-        <w:t xml:space="preserve"> de desarrollo</w:t>
-      </w:r>
-      <w:r>
-        <w:t>, el modelo de dominio rígido es un</w:t>
-      </w:r>
-      <w:r>
-        <w:t>a barrera</w:t>
-      </w:r>
-      <w:r>
-        <w:t xml:space="preserve"> de</w:t>
-      </w:r>
-      <w:r>
-        <w:t>l</w:t>
-      </w:r>
-      <w:r>
-        <w:t xml:space="preserve"> negocio</w:t>
-      </w:r>
-      <w:r>
-        <w:t>. Si la farmacia necesita lanzar la venta de consultas médicas</w:t>
-      </w:r>
-      <w:r>
-        <w:t xml:space="preserve"> en el futuro</w:t>
-      </w:r>
-      <w:r>
-        <w:t xml:space="preserve">, el sistema </w:t>
-      </w:r>
-      <w:r>
-        <w:t>va a fallar</w:t>
-      </w:r>
-      <w:r>
-        <w:t xml:space="preserve"> al </w:t>
-      </w:r>
-      <w:r>
-        <w:t>obligar a tener</w:t>
-      </w:r>
-      <w:r>
-        <w:t xml:space="preserve"> una fecha de vencimiento para una consulta. Solucionar el problema de diseño en el dominio </w:t>
-      </w:r>
-      <w:r>
-        <w:t>permite dar</w:t>
-      </w:r>
-      <w:r>
-        <w:t xml:space="preserve"> valor comercial </w:t>
-      </w:r>
-      <w:r>
-        <w:t>al sistema rápidamente</w:t>
-      </w:r>
-      <w:r>
-        <w:t xml:space="preserve">, lo </w:t>
-      </w:r>
-      <w:r>
-        <w:t>que</w:t>
-      </w:r>
-      <w:r>
-        <w:t xml:space="preserve"> justifica priorizarlo </w:t>
-      </w:r>
-      <w:r>
-        <w:t>antes que</w:t>
-      </w:r>
-      <w:r>
-        <w:t xml:space="preserve"> la</w:t>
-      </w:r>
-      <w:r>
-        <w:t xml:space="preserve">s </w:t>
-      </w:r>
-      <w:proofErr w:type="gramStart"/>
-      <w:r>
-        <w:t xml:space="preserve">fallas </w:t>
-      </w:r>
-      <w:r>
-        <w:t>técnica</w:t>
-      </w:r>
-      <w:proofErr w:type="gramEnd"/>
-      <w:r>
-        <w:t xml:space="preserve"> interna</w:t>
-      </w:r>
-      <w:r>
-        <w:t>s</w:t>
-      </w:r>
-      <w:r>
-        <w:t xml:space="preserve"> de los servicios, </w:t>
-      </w:r>
-      <w:r>
-        <w:t>que su</w:t>
-      </w:r>
-      <w:r>
-        <w:t xml:space="preserve"> impacto no es visible </w:t>
-      </w:r>
-      <w:r>
-        <w:t xml:space="preserve">tan fácilmente </w:t>
-      </w:r>
-      <w:r>
-        <w:t xml:space="preserve">para el usuario final o </w:t>
-      </w:r>
-      <w:r>
-        <w:t>para el</w:t>
-      </w:r>
-      <w:r>
-        <w:t xml:space="preserve"> negocio.</w:t>
+        <w:t>¿Por qué el #2 es más crítico que el #3?:</w:t>
+      </w:r>
+      <w:r>
+        <w:t xml:space="preserve"> Mientras que el acoplamiento de los servicios hacia sus dependencias concretas es un problema técnico de mantenibilidad que afecta al equipo de desarrollo, el modelo de dominio rígido es una barrera del negocio. Si la farmacia necesita lanzar la venta de consultas médicas en el futuro, el sistema va a fallar al obligar a tener una fecha de vencimiento para una consulta. Solucionar el problema de diseño en el dominio permite dar valor comercial al sistema rápidamente, lo que justifica priorizarlo antes que las fallas técnicas internas de los servicios, que su impacto no es visible tan fácilmente para el usuario final o para el negocio.</w:t>
       </w:r>
     </w:p>
     <w:p/>
@@ -2113,6 +2007,7 @@
   <w:style w:type="character" w:default="1" w:styleId="Fuentedeprrafopredeter">
     <w:name w:val="Default Paragraph Font"/>
     <w:uiPriority w:val="1"/>
+    <w:semiHidden/>
     <w:unhideWhenUsed/>
   </w:style>
   <w:style w:type="table" w:default="1" w:styleId="Tablanormal">

</xml_diff>